<commit_message>
review: blok info single spacing + Calibri 10 (FT/VA & QRIS)
</commit_message>
<xml_diff>
--- a/output/Lampiran 7C - Ezeelink.docx
+++ b/output/Lampiran 7C - Ezeelink.docx
@@ -31,33 +31,49 @@
     <w:p/>
     <w:p>
       <w:pPr>
-        <w:spacing w:before="0" w:after="0" w:line="360" w:lineRule="auto"/>
+        <w:spacing w:before="0" w:after="0" w:line="240" w:lineRule="auto"/>
       </w:pPr>
       <w:r>
+        <w:rPr>
+          <w:rFonts w:ascii="Calibri" w:hAnsi="Calibri"/>
+          <w:sz w:val="20"/>
+        </w:rPr>
         <w:t>Nama Penyedia Layanan : Bank Sahabat Sampoerna</w:t>
       </w:r>
     </w:p>
     <w:p>
       <w:pPr>
-        <w:spacing w:before="0" w:after="0" w:line="360" w:lineRule="auto"/>
+        <w:spacing w:before="0" w:after="0" w:line="240" w:lineRule="auto"/>
       </w:pPr>
       <w:r>
+        <w:rPr>
+          <w:rFonts w:ascii="Calibri" w:hAnsi="Calibri"/>
+          <w:sz w:val="20"/>
+        </w:rPr>
         <w:t xml:space="preserve">Nama Pengguna Layanan : </w:t>
       </w:r>
     </w:p>
     <w:p>
       <w:pPr>
-        <w:spacing w:before="0" w:after="0" w:line="360" w:lineRule="auto"/>
+        <w:spacing w:before="0" w:after="0" w:line="240" w:lineRule="auto"/>
       </w:pPr>
       <w:r>
+        <w:rPr>
+          <w:rFonts w:ascii="Calibri" w:hAnsi="Calibri"/>
+          <w:sz w:val="20"/>
+        </w:rPr>
         <w:t>Nama Layanan API      : API Balance Inquiry</w:t>
       </w:r>
     </w:p>
     <w:p>
       <w:pPr>
-        <w:spacing w:before="0" w:after="0" w:line="360" w:lineRule="auto"/>
+        <w:spacing w:before="0" w:after="0" w:line="240" w:lineRule="auto"/>
       </w:pPr>
       <w:r>
+        <w:rPr>
+          <w:rFonts w:ascii="Calibri" w:hAnsi="Calibri"/>
+          <w:sz w:val="20"/>
+        </w:rPr>
         <w:t xml:space="preserve">Tanggal Pengujian     : </w:t>
       </w:r>
     </w:p>
@@ -2893,33 +2909,49 @@
     </w:p>
     <w:p>
       <w:pPr>
-        <w:spacing w:before="0" w:after="0" w:line="360" w:lineRule="auto"/>
+        <w:spacing w:before="0" w:after="0" w:line="240" w:lineRule="auto"/>
       </w:pPr>
       <w:r>
+        <w:rPr>
+          <w:rFonts w:ascii="Calibri" w:hAnsi="Calibri"/>
+          <w:sz w:val="20"/>
+        </w:rPr>
         <w:t>Nama Penyedia Layanan : Bank Sahabat Sampoerna</w:t>
       </w:r>
     </w:p>
     <w:p>
       <w:pPr>
-        <w:spacing w:before="0" w:after="0" w:line="360" w:lineRule="auto"/>
+        <w:spacing w:before="0" w:after="0" w:line="240" w:lineRule="auto"/>
       </w:pPr>
       <w:r>
+        <w:rPr>
+          <w:rFonts w:ascii="Calibri" w:hAnsi="Calibri"/>
+          <w:sz w:val="20"/>
+        </w:rPr>
         <w:t xml:space="preserve">Nama Pengguna Layanan : </w:t>
       </w:r>
     </w:p>
     <w:p>
       <w:pPr>
-        <w:spacing w:before="0" w:after="0" w:line="360" w:lineRule="auto"/>
+        <w:spacing w:before="0" w:after="0" w:line="240" w:lineRule="auto"/>
       </w:pPr>
       <w:r>
+        <w:rPr>
+          <w:rFonts w:ascii="Calibri" w:hAnsi="Calibri"/>
+          <w:sz w:val="20"/>
+        </w:rPr>
         <w:t>Nama Layanan API      : Intrabank Transfer</w:t>
       </w:r>
     </w:p>
     <w:p>
       <w:pPr>
-        <w:spacing w:before="0" w:after="0" w:line="360" w:lineRule="auto"/>
+        <w:spacing w:before="0" w:after="0" w:line="240" w:lineRule="auto"/>
       </w:pPr>
       <w:r>
+        <w:rPr>
+          <w:rFonts w:ascii="Calibri" w:hAnsi="Calibri"/>
+          <w:sz w:val="20"/>
+        </w:rPr>
         <w:t xml:space="preserve">Tanggal Pengujian     : </w:t>
       </w:r>
     </w:p>
@@ -8278,33 +8310,49 @@
     </w:p>
     <w:p>
       <w:pPr>
-        <w:spacing w:before="0" w:after="0" w:line="360" w:lineRule="auto"/>
+        <w:spacing w:before="0" w:after="0" w:line="240" w:lineRule="auto"/>
       </w:pPr>
       <w:r>
+        <w:rPr>
+          <w:rFonts w:ascii="Calibri" w:hAnsi="Calibri"/>
+          <w:sz w:val="20"/>
+        </w:rPr>
         <w:t>Nama Penyedia Layanan : Bank Sahabat Sampoerna</w:t>
       </w:r>
     </w:p>
     <w:p>
       <w:pPr>
-        <w:spacing w:before="0" w:after="0" w:line="360" w:lineRule="auto"/>
+        <w:spacing w:before="0" w:after="0" w:line="240" w:lineRule="auto"/>
       </w:pPr>
       <w:r>
+        <w:rPr>
+          <w:rFonts w:ascii="Calibri" w:hAnsi="Calibri"/>
+          <w:sz w:val="20"/>
+        </w:rPr>
         <w:t xml:space="preserve">Nama Pengguna Layanan : </w:t>
       </w:r>
     </w:p>
     <w:p>
       <w:pPr>
-        <w:spacing w:before="0" w:after="0" w:line="360" w:lineRule="auto"/>
+        <w:spacing w:before="0" w:after="0" w:line="240" w:lineRule="auto"/>
       </w:pPr>
       <w:r>
+        <w:rPr>
+          <w:rFonts w:ascii="Calibri" w:hAnsi="Calibri"/>
+          <w:sz w:val="20"/>
+        </w:rPr>
         <w:t>Nama Layanan API      : Interbank Transfer</w:t>
       </w:r>
     </w:p>
     <w:p>
       <w:pPr>
-        <w:spacing w:before="0" w:after="0" w:line="360" w:lineRule="auto"/>
+        <w:spacing w:before="0" w:after="0" w:line="240" w:lineRule="auto"/>
       </w:pPr>
       <w:r>
+        <w:rPr>
+          <w:rFonts w:ascii="Calibri" w:hAnsi="Calibri"/>
+          <w:sz w:val="20"/>
+        </w:rPr>
         <w:t xml:space="preserve">Tanggal Pengujian     : </w:t>
       </w:r>
     </w:p>
@@ -13985,33 +14033,49 @@
     </w:p>
     <w:p>
       <w:pPr>
-        <w:spacing w:before="0" w:after="0" w:line="360" w:lineRule="auto"/>
+        <w:spacing w:before="0" w:after="0" w:line="240" w:lineRule="auto"/>
       </w:pPr>
       <w:r>
+        <w:rPr>
+          <w:rFonts w:ascii="Calibri" w:hAnsi="Calibri"/>
+          <w:sz w:val="20"/>
+        </w:rPr>
         <w:t>Nama Penyedia Layanan : Bank Sahabat Sampoerna</w:t>
       </w:r>
     </w:p>
     <w:p>
       <w:pPr>
-        <w:spacing w:before="0" w:after="0" w:line="360" w:lineRule="auto"/>
+        <w:spacing w:before="0" w:after="0" w:line="240" w:lineRule="auto"/>
       </w:pPr>
       <w:r>
+        <w:rPr>
+          <w:rFonts w:ascii="Calibri" w:hAnsi="Calibri"/>
+          <w:sz w:val="20"/>
+        </w:rPr>
         <w:t xml:space="preserve">Nama Pengguna Layanan : </w:t>
       </w:r>
     </w:p>
     <w:p>
       <w:pPr>
-        <w:spacing w:before="0" w:after="0" w:line="360" w:lineRule="auto"/>
+        <w:spacing w:before="0" w:after="0" w:line="240" w:lineRule="auto"/>
       </w:pPr>
       <w:r>
+        <w:rPr>
+          <w:rFonts w:ascii="Calibri" w:hAnsi="Calibri"/>
+          <w:sz w:val="20"/>
+        </w:rPr>
         <w:t>Nama Layanan API      : API RTGS Transfer</w:t>
       </w:r>
     </w:p>
     <w:p>
       <w:pPr>
-        <w:spacing w:before="0" w:after="0" w:line="360" w:lineRule="auto"/>
+        <w:spacing w:before="0" w:after="0" w:line="240" w:lineRule="auto"/>
       </w:pPr>
       <w:r>
+        <w:rPr>
+          <w:rFonts w:ascii="Calibri" w:hAnsi="Calibri"/>
+          <w:sz w:val="20"/>
+        </w:rPr>
         <w:t xml:space="preserve">Tanggal Pengujian     : </w:t>
       </w:r>
     </w:p>
@@ -20220,33 +20284,49 @@
     </w:p>
     <w:p>
       <w:pPr>
-        <w:spacing w:before="0" w:after="0" w:line="360" w:lineRule="auto"/>
+        <w:spacing w:before="0" w:after="0" w:line="240" w:lineRule="auto"/>
       </w:pPr>
       <w:r>
+        <w:rPr>
+          <w:rFonts w:ascii="Calibri" w:hAnsi="Calibri"/>
+          <w:sz w:val="20"/>
+        </w:rPr>
         <w:t>Nama Penyedia Layanan : Bank Sahabat Sampoerna</w:t>
       </w:r>
     </w:p>
     <w:p>
       <w:pPr>
-        <w:spacing w:before="0" w:after="0" w:line="360" w:lineRule="auto"/>
+        <w:spacing w:before="0" w:after="0" w:line="240" w:lineRule="auto"/>
       </w:pPr>
       <w:r>
+        <w:rPr>
+          <w:rFonts w:ascii="Calibri" w:hAnsi="Calibri"/>
+          <w:sz w:val="20"/>
+        </w:rPr>
         <w:t xml:space="preserve">Nama Pengguna Layanan : </w:t>
       </w:r>
     </w:p>
     <w:p>
       <w:pPr>
-        <w:spacing w:before="0" w:after="0" w:line="360" w:lineRule="auto"/>
+        <w:spacing w:before="0" w:after="0" w:line="240" w:lineRule="auto"/>
       </w:pPr>
       <w:r>
+        <w:rPr>
+          <w:rFonts w:ascii="Calibri" w:hAnsi="Calibri"/>
+          <w:sz w:val="20"/>
+        </w:rPr>
         <w:t>Nama Layanan API      : API SKNBI Transfer</w:t>
       </w:r>
     </w:p>
     <w:p>
       <w:pPr>
-        <w:spacing w:before="0" w:after="0" w:line="360" w:lineRule="auto"/>
+        <w:spacing w:before="0" w:after="0" w:line="240" w:lineRule="auto"/>
       </w:pPr>
       <w:r>
+        <w:rPr>
+          <w:rFonts w:ascii="Calibri" w:hAnsi="Calibri"/>
+          <w:sz w:val="20"/>
+        </w:rPr>
         <w:t xml:space="preserve">Tanggal Pengujian     : </w:t>
       </w:r>
     </w:p>
@@ -26103,33 +26183,49 @@
     </w:p>
     <w:p>
       <w:pPr>
-        <w:spacing w:before="0" w:after="0" w:line="360" w:lineRule="auto"/>
+        <w:spacing w:before="0" w:after="0" w:line="240" w:lineRule="auto"/>
       </w:pPr>
       <w:r>
+        <w:rPr>
+          <w:rFonts w:ascii="Calibri" w:hAnsi="Calibri"/>
+          <w:sz w:val="20"/>
+        </w:rPr>
         <w:t>Nama Penyedia Layanan : Bank Sahabat Sampoerna</w:t>
       </w:r>
     </w:p>
     <w:p>
       <w:pPr>
-        <w:spacing w:before="0" w:after="0" w:line="360" w:lineRule="auto"/>
+        <w:spacing w:before="0" w:after="0" w:line="240" w:lineRule="auto"/>
       </w:pPr>
       <w:r>
+        <w:rPr>
+          <w:rFonts w:ascii="Calibri" w:hAnsi="Calibri"/>
+          <w:sz w:val="20"/>
+        </w:rPr>
         <w:t xml:space="preserve">Nama Pengguna Layanan : </w:t>
       </w:r>
     </w:p>
     <w:p>
       <w:pPr>
-        <w:spacing w:before="0" w:after="0" w:line="360" w:lineRule="auto"/>
+        <w:spacing w:before="0" w:after="0" w:line="240" w:lineRule="auto"/>
       </w:pPr>
       <w:r>
+        <w:rPr>
+          <w:rFonts w:ascii="Calibri" w:hAnsi="Calibri"/>
+          <w:sz w:val="20"/>
+        </w:rPr>
         <w:t>Nama Layanan API      : API Virtual Account</w:t>
       </w:r>
     </w:p>
     <w:p>
       <w:pPr>
-        <w:spacing w:before="0" w:after="0" w:line="360" w:lineRule="auto"/>
+        <w:spacing w:before="0" w:after="0" w:line="240" w:lineRule="auto"/>
       </w:pPr>
       <w:r>
+        <w:rPr>
+          <w:rFonts w:ascii="Calibri" w:hAnsi="Calibri"/>
+          <w:sz w:val="20"/>
+        </w:rPr>
         <w:t xml:space="preserve">Tanggal Pengujian     : </w:t>
       </w:r>
     </w:p>

</xml_diff>

<commit_message>
review: footer ketentuan ASPI (FT/VA & QRIS)
</commit_message>
<xml_diff>
--- a/output/Lampiran 7C - Ezeelink.docx
+++ b/output/Lampiran 7C - Ezeelink.docx
@@ -35007,6 +35007,97 @@
         </w:tc>
       </w:tr>
     </w:tbl>
+    <w:p/>
+    <w:p>
+      <w:pPr>
+        <w:spacing w:before="0" w:after="40" w:line="240" w:lineRule="auto"/>
+        <w:ind w:left="283"/>
+      </w:pPr>
+      <w:r>
+        <w:rPr>
+          <w:rFonts w:ascii="Calibri" w:hAnsi="Calibri"/>
+          <w:sz w:val="20"/>
+        </w:rPr>
+        <w:t>-</w:t>
+        <w:tab/>
+        <w:t>Lampiran Skenario hasil uji fungsional sekurangnya 1 Pengguna Layanan atas 1 sub API unverified, dengan ketentuan sebagai berikut:</w:t>
+      </w:r>
+    </w:p>
+    <w:p>
+      <w:pPr>
+        <w:spacing w:before="0" w:after="40" w:line="240" w:lineRule="auto"/>
+        <w:ind w:left="680"/>
+      </w:pPr>
+      <w:r>
+        <w:rPr>
+          <w:rFonts w:ascii="Calibri" w:hAnsi="Calibri"/>
+          <w:sz w:val="20"/>
+        </w:rPr>
+        <w:t>a.</w:t>
+        <w:tab/>
+        <w:t>Pada kolom request diisi dengan request yang dilakukan Pengguna layanan, sedangkan pada kolom response diisi dengan respon yang diberikan Penyedia. Sementara pada kolom result diisi dengan hasil PASS atau NOT PASS yang harus sesuai dengan expected result.</w:t>
+      </w:r>
+    </w:p>
+    <w:p>
+      <w:pPr>
+        <w:spacing w:before="0" w:after="40" w:line="240" w:lineRule="auto"/>
+        <w:ind w:left="680"/>
+      </w:pPr>
+      <w:r>
+        <w:rPr>
+          <w:rFonts w:ascii="Calibri" w:hAnsi="Calibri"/>
+          <w:sz w:val="20"/>
+        </w:rPr>
+        <w:t>b.</w:t>
+        <w:tab/>
+        <w:t>Pengisian pada dokumen skenario hasil uji fungsional tidak dilakukan dengan cara screen capture, melainkan dilakukan dengan cara copy paste payload request dan response dari log API server ke kolom tabel skenario hasil uji fungsional</w:t>
+      </w:r>
+    </w:p>
+    <w:p>
+      <w:pPr>
+        <w:spacing w:before="0" w:after="40" w:line="240" w:lineRule="auto"/>
+        <w:ind w:left="680"/>
+      </w:pPr>
+      <w:r>
+        <w:rPr>
+          <w:rFonts w:ascii="Calibri" w:hAnsi="Calibri"/>
+          <w:sz w:val="20"/>
+        </w:rPr>
+        <w:t>c.</w:t>
+        <w:tab/>
+        <w:t>Seluruh skenario diujikan dan tidak boleh dihapus atau diubah. Dalam hal terdapat skenario yang tidak diujikan dapat dikosongkan pengisiannya, namun diberikan catatan pada kolom Notes yang akan kami review lebih lanjut apakah skenario diperkenankan untuk tidak diujikan.</w:t>
+      </w:r>
+    </w:p>
+    <w:p>
+      <w:pPr>
+        <w:spacing w:before="0" w:after="40" w:line="240" w:lineRule="auto"/>
+        <w:ind w:left="680"/>
+      </w:pPr>
+      <w:r>
+        <w:rPr>
+          <w:rFonts w:ascii="Calibri" w:hAnsi="Calibri"/>
+          <w:sz w:val="20"/>
+        </w:rPr>
+        <w:t>d.</w:t>
+        <w:tab/>
+        <w:t>Dalam hal terdapat penambahan skenario pengujian, maka penambahan tersebut dilakukan pada baris paling bawah, sehingga tidak mengubah susunan atau urutan template skenario.</w:t>
+      </w:r>
+    </w:p>
+    <w:p>
+      <w:pPr>
+        <w:spacing w:before="0" w:after="40" w:line="240" w:lineRule="auto"/>
+        <w:ind w:left="283"/>
+      </w:pPr>
+      <w:r>
+        <w:rPr>
+          <w:rFonts w:ascii="Calibri" w:hAnsi="Calibri"/>
+          <w:sz w:val="20"/>
+        </w:rPr>
+        <w:t>-</w:t>
+        <w:tab/>
+        <w:t>Dalam hal SELURUH sub API yang diajukan telah verified, tidak perlu menyampaikan dokumen skenario uji fungsional.</w:t>
+      </w:r>
+    </w:p>
     <w:sectPr>
       <w:pgSz w:w="15840" w:h="12240" w:orient="landscape"/>
       <w:pgMar w:top="720" w:right="720" w:bottom="720" w:left="510" w:header="720" w:footer="720" w:gutter="0"/>

</xml_diff>